<commit_message>
Te Whiā Command Week 2026: NZALC support to 2 ER
Rebuilt to the revised text: title Te Whiā Command Week 2026 with the
NZALC support kicker, purpose and context sections, two linked
programme phases with the Tuesday flexibility period noted separately,
delivery details for up to 17 command-team personnel, and five
coordination items. PDF and Word both fit one page.

Co-Authored-By: Claude Fable 5.1 <noreply@anthropic.com>
Claude-Session: https://claude.ai/code/session_01LgFPs3fMSncBgbYQ3PfA3o
</commit_message>
<xml_diff>
--- a/output/2er-command-week-nzalc-support.docx
+++ b/output/2er-command-week-nzalc-support.docx
@@ -54,6 +54,26 @@
         <w:pStyle w:val="Normal"/>
         <w:keepNext w:val="true"/>
         <w:pageBreakBefore w:val="false"/>
+        <w:spacing w:before="0" w:after="0"/>
+        <w:rPr/>
+      </w:pPr>
+      <w:r>
+        <w:rPr>
+          <w:rFonts w:cs="Arial"/>
+          <w:b/>
+          <w:i w:val="false"/>
+          <w:color w:val="002516"/>
+          <w:spacing w:val="40"/>
+          <w:sz w:val="20"/>
+        </w:rPr>
+        <w:t>NZALC LEADERSHIP DEVELOPMENT SUPPORT TO 2 ER</w:t>
+      </w:r>
+    </w:p>
+    <w:p>
+      <w:pPr>
+        <w:pStyle w:val="Normal"/>
+        <w:keepNext w:val="true"/>
+        <w:pageBreakBefore w:val="false"/>
         <w:spacing w:before="0" w:after="80"/>
         <w:rPr/>
       </w:pPr>
@@ -64,7 +84,7 @@
           <w:color w:val="000000"/>
           <w:sz w:val="48"/>
         </w:rPr>
-        <w:t>2 ER Command Off-site</w:t>
+        <w:t>Te Whiā Command Week 2026</w:t>
       </w:r>
     </w:p>
     <w:p>
@@ -140,6 +160,7 @@
     <w:p>
       <w:pPr>
         <w:pStyle w:val="Heading1"/>
+        <w:spacing w:before="180" w:after="80"/>
         <w:rPr/>
       </w:pPr>
       <w:r>
@@ -156,6 +177,7 @@
     <w:p>
       <w:pPr>
         <w:pStyle w:val="Normal"/>
+        <w:spacing w:lineRule="auto" w:line="264" w:before="0" w:after="80"/>
         <w:rPr/>
       </w:pPr>
       <w:r>
@@ -164,12 +186,30 @@
           <w:b w:val="false"/>
           <w:i w:val="false"/>
         </w:rPr>
-        <w:t>NZALC will support the 2 ER Command Off-site by delivering a two-phase leadership development package for up to 18 personnel.</w:t>
-      </w:r>
-    </w:p>
-    <w:p>
-      <w:pPr>
-        <w:pStyle w:val="Normal"/>
+        <w:t>To outline NZALC's contribution to Te Whiā Command Week 2026.</w:t>
+      </w:r>
+    </w:p>
+    <w:p>
+      <w:pPr>
+        <w:pStyle w:val="Heading1"/>
+        <w:spacing w:before="180" w:after="80"/>
+        <w:rPr/>
+      </w:pPr>
+      <w:r>
+        <w:rPr>
+          <w:rFonts w:cs="Arial"/>
+          <w:b/>
+          <w:i w:val="false"/>
+          <w:color w:val="002516"/>
+          <w:sz w:val="25"/>
+        </w:rPr>
+        <w:t>Context</w:t>
+      </w:r>
+    </w:p>
+    <w:p>
+      <w:pPr>
+        <w:pStyle w:val="Normal"/>
+        <w:spacing w:lineRule="auto" w:line="264" w:before="0" w:after="80"/>
         <w:rPr/>
       </w:pPr>
       <w:r>
@@ -178,12 +218,13 @@
           <w:b w:val="false"/>
           <w:i w:val="false"/>
         </w:rPr>
-        <w:t>The package is designed to build individual self-awareness before shifting the focus to team effectiveness and collective performance.</w:t>
+        <w:t>2 ER intends to bring its new and future command teams together in a relaxed environment away from normal unit routines. The emphasis is on connection and reflection: building self-awareness, examining individual leadership styles and personality preferences, and strengthening key command relationships.</w:t>
       </w:r>
     </w:p>
     <w:p>
       <w:pPr>
         <w:pStyle w:val="Heading1"/>
+        <w:spacing w:before="180" w:after="80"/>
         <w:rPr/>
       </w:pPr>
       <w:r>
@@ -195,6 +236,21 @@
           <w:sz w:val="25"/>
         </w:rPr>
         <w:t>Programme</w:t>
+      </w:r>
+    </w:p>
+    <w:p>
+      <w:pPr>
+        <w:pStyle w:val="Normal"/>
+        <w:spacing w:lineRule="auto" w:line="264" w:before="0" w:after="80"/>
+        <w:rPr/>
+      </w:pPr>
+      <w:r>
+        <w:rPr>
+          <w:rFonts w:cs="Arial"/>
+          <w:b w:val="false"/>
+          <w:i w:val="false"/>
+        </w:rPr>
+        <w:t>NZALC will support this through two linked phases.</w:t>
       </w:r>
     </w:p>
     <w:tbl>
@@ -391,95 +447,7 @@
                 <w:i w:val="false"/>
                 <w:sz w:val="18"/>
               </w:rPr>
-              <w:t>Facilitated exploration of individual leadership preferences, strengths, potential limitations and impact on others.</w:t>
-            </w:r>
-          </w:p>
-        </w:tc>
-      </w:tr>
-      <w:tr>
-        <w:trPr>
-          <w:cantSplit w:val="true"/>
-        </w:trPr>
-        <w:tc>
-          <w:tcPr>
-            <w:tcW w:w="2040" w:type="dxa"/>
-            <w:tcBorders>
-              <w:top w:val="single" w:sz="4" w:space="0" w:color="D9D9D2"/>
-              <w:left w:val="single" w:sz="4" w:space="0" w:color="A89662"/>
-              <w:bottom w:val="single" w:sz="4" w:space="0" w:color="D9D9D2"/>
-              <w:right w:val="single" w:sz="4" w:space="0" w:color="D9D9D2"/>
-            </w:tcBorders>
-            <w:shd w:color="auto" w:fill="CDD2B7" w:val="clear"/>
-          </w:tcPr>
-          <w:p>
-            <w:pPr>
-              <w:pStyle w:val="Normal"/>
-              <w:spacing w:lineRule="auto" w:line="268" w:before="0" w:after="0"/>
-              <w:rPr/>
-            </w:pPr>
-            <w:r>
-              <w:rPr>
-                <w:rFonts w:cs="Arial"/>
-                <w:b/>
-                <w:i w:val="false"/>
-                <w:color w:val="002516"/>
-                <w:sz w:val="18"/>
-              </w:rPr>
-              <w:t>Tuesday 17 November, 0800 to 1200</w:t>
-            </w:r>
-          </w:p>
-        </w:tc>
-        <w:tc>
-          <w:tcPr>
-            <w:tcW w:w="3629" w:type="dxa"/>
-            <w:tcBorders>
-              <w:top w:val="single" w:sz="4" w:space="0" w:color="D9D9D2"/>
-              <w:left w:val="single" w:sz="4" w:space="0" w:color="D9D9D2"/>
-              <w:bottom w:val="single" w:sz="4" w:space="0" w:color="D9D9D2"/>
-              <w:right w:val="single" w:sz="4" w:space="0" w:color="D9D9D2"/>
-            </w:tcBorders>
-          </w:tcPr>
-          <w:p>
-            <w:pPr>
-              <w:pStyle w:val="Normal"/>
-              <w:spacing w:lineRule="auto" w:line="268" w:before="0" w:after="0"/>
-              <w:rPr/>
-            </w:pPr>
-            <w:r>
-              <w:rPr>
-                <w:rFonts w:cs="Arial"/>
-                <w:b w:val="false"/>
-                <w:i w:val="false"/>
-                <w:sz w:val="18"/>
-              </w:rPr>
-              <w:t>ROCKET Model</w:t>
-            </w:r>
-          </w:p>
-        </w:tc>
-        <w:tc>
-          <w:tcPr>
-            <w:tcW w:w="3628" w:type="dxa"/>
-            <w:tcBorders>
-              <w:top w:val="single" w:sz="4" w:space="0" w:color="D9D9D2"/>
-              <w:left w:val="single" w:sz="4" w:space="0" w:color="D9D9D2"/>
-              <w:bottom w:val="single" w:sz="4" w:space="0" w:color="D9D9D2"/>
-              <w:right w:val="single" w:sz="4" w:space="0" w:color="A89662"/>
-            </w:tcBorders>
-          </w:tcPr>
-          <w:p>
-            <w:pPr>
-              <w:pStyle w:val="Normal"/>
-              <w:spacing w:lineRule="auto" w:line="268" w:before="0" w:after="0"/>
-              <w:rPr/>
-            </w:pPr>
-            <w:r>
-              <w:rPr>
-                <w:rFonts w:cs="Arial"/>
-                <w:b w:val="false"/>
-                <w:i w:val="false"/>
-                <w:sz w:val="18"/>
-              </w:rPr>
-              <w:t>Facilitated team development session focused on the conditions required for effective team performance.</w:t>
+              <w:t>Facilitated exploration of individual leadership preferences, strengths, potential limitations and impact on others, including the implications for command relationships.</w:t>
             </w:r>
           </w:p>
         </w:tc>
@@ -513,7 +481,7 @@
                 <w:color w:val="002516"/>
                 <w:sz w:val="18"/>
               </w:rPr>
-              <w:t>Tuesday 17 November, 1200 to 1400</w:t>
+              <w:t>Tuesday 17 November, 0800 to 1200</w:t>
             </w:r>
           </w:p>
         </w:tc>
@@ -540,7 +508,7 @@
                 <w:i w:val="false"/>
                 <w:sz w:val="18"/>
               </w:rPr>
-              <w:t>Protected white space</w:t>
+              <w:t>ROCKET Model</w:t>
             </w:r>
           </w:p>
         </w:tc>
@@ -567,7 +535,7 @@
                 <w:i w:val="false"/>
                 <w:sz w:val="18"/>
               </w:rPr>
-              <w:t>Available if required to continue productive discussion, consolidate learning or explore issues arising during the session.</w:t>
+              <w:t>Facilitated application of the ROCKET Model to establish the conditions required for effective command teams.</w:t>
             </w:r>
           </w:p>
         </w:tc>
@@ -586,6 +554,7 @@
     <w:p>
       <w:pPr>
         <w:pStyle w:val="Normal"/>
+        <w:spacing w:lineRule="auto" w:line="264" w:before="0" w:after="80"/>
         <w:rPr/>
       </w:pPr>
       <w:r>
@@ -594,12 +563,28 @@
           <w:b w:val="false"/>
           <w:i w:val="false"/>
         </w:rPr>
-        <w:t>NZALC's contribution will conclude no later than 1400 Tuesday. The remainder of the week will continue under 2 ER's command arrangements.</w:t>
+        <w:t>The period 1200 to 1400 Tuesday will be retained as flexibility to continue productive discussion or consolidate learning if required.</w:t>
+      </w:r>
+    </w:p>
+    <w:p>
+      <w:pPr>
+        <w:pStyle w:val="Normal"/>
+        <w:spacing w:lineRule="auto" w:line="264" w:before="0" w:after="80"/>
+        <w:rPr/>
+      </w:pPr>
+      <w:r>
+        <w:rPr>
+          <w:rFonts w:cs="Arial"/>
+          <w:b w:val="false"/>
+          <w:i w:val="false"/>
+        </w:rPr>
+        <w:t>NZALC support will conclude no later than 1400 Tuesday 17 November. The remainder of Command Week will continue under 2 ER command arrangements.</w:t>
       </w:r>
     </w:p>
     <w:p>
       <w:pPr>
         <w:pStyle w:val="Heading1"/>
+        <w:spacing w:before="180" w:after="80"/>
         <w:rPr/>
       </w:pPr>
       <w:r>
@@ -698,7 +683,7 @@
           <w:b w:val="false"/>
           <w:i w:val="false"/>
         </w:rPr>
-        <w:t xml:space="preserve"> Up to 18 personnel</w:t>
+        <w:t xml:space="preserve"> Up to 17 personnel drawn from 2 ER unit and sub-unit command teams and relevant principal staff.</w:t>
       </w:r>
     </w:p>
     <w:p>
@@ -742,7 +727,7 @@
           <w:b w:val="false"/>
           <w:i w:val="false"/>
         </w:rPr>
-        <w:t xml:space="preserve"> Off-site venue in the Palmerston North area; exact location to be confirmed</w:t>
+        <w:t xml:space="preserve"> Off-site venue in the Palmerston North area; exact location to be confirmed.</w:t>
       </w:r>
     </w:p>
     <w:p>
@@ -778,7 +763,7 @@
           <w:b/>
           <w:i w:val="false"/>
         </w:rPr>
-        <w:t>Requirement:</w:t>
+        <w:t>Participant requirement:</w:t>
       </w:r>
       <w:r>
         <w:rPr>
@@ -786,12 +771,13 @@
           <w:b w:val="false"/>
           <w:i w:val="false"/>
         </w:rPr>
-        <w:t xml:space="preserve"> Each participant will complete a Leadership Personality Report before the facilitated session</w:t>
+        <w:t xml:space="preserve"> Each participant is to complete a Leadership Personality Report before the facilitated session.</w:t>
       </w:r>
     </w:p>
     <w:p>
       <w:pPr>
         <w:pStyle w:val="Heading1"/>
+        <w:spacing w:before="180" w:after="80"/>
         <w:rPr/>
       </w:pPr>
       <w:r>
@@ -808,6 +794,7 @@
     <w:p>
       <w:pPr>
         <w:pStyle w:val="Normal"/>
+        <w:spacing w:lineRule="auto" w:line="264" w:before="0" w:after="80"/>
         <w:rPr/>
       </w:pPr>
       <w:r>
@@ -888,7 +875,7 @@
           <w:b w:val="false"/>
           <w:i w:val="false"/>
         </w:rPr>
-        <w:t>off-site venue and available training facilities;</w:t>
+        <w:t>relevant command relationships and team transitions;</w:t>
       </w:r>
     </w:p>
     <w:p>
@@ -924,7 +911,7 @@
           <w:b w:val="false"/>
           <w:i w:val="false"/>
         </w:rPr>
-        <w:t>arrangements and timelines for completing the Leadership Personality Reports; and</w:t>
+        <w:t>venue and available training facilities;</w:t>
       </w:r>
     </w:p>
     <w:p>
@@ -960,7 +947,43 @@
           <w:b w:val="false"/>
           <w:i w:val="false"/>
         </w:rPr>
-        <w:t>any specific command outcomes or team issues that should inform the facilitation.</w:t>
+        <w:t>arrangements and timelines for completing the Leadership Personality Reports; and</w:t>
+      </w:r>
+    </w:p>
+    <w:p>
+      <w:pPr>
+        <w:pStyle w:val="Normal"/>
+        <w:tabs>
+          <w:tab w:val="clear" w:pos="720"/>
+          <w:tab w:val="left" w:pos="397" w:leader="none"/>
+        </w:tabs>
+        <w:spacing w:before="0" w:after="40"/>
+        <w:ind w:hanging="238" w:left="397"/>
+        <w:rPr/>
+      </w:pPr>
+      <w:r>
+        <w:rPr>
+          <w:rFonts w:cs="Arial"/>
+          <w:b/>
+          <w:color w:val="002516"/>
+        </w:rPr>
+        <w:t>•</w:t>
+      </w:r>
+      <w:r>
+        <w:rPr>
+          <w:rFonts w:cs="Arial"/>
+          <w:b/>
+          <w:color w:val="002516"/>
+        </w:rPr>
+        <w:tab/>
+      </w:r>
+      <w:r>
+        <w:rPr>
+          <w:rFonts w:cs="Arial"/>
+          <w:b w:val="false"/>
+          <w:i w:val="false"/>
+        </w:rPr>
+        <w:t>any specific command outcomes that should inform the facilitation.</w:t>
       </w:r>
     </w:p>
     <w:sectPr>
@@ -1032,7 +1055,7 @@
         <w:color w:val="000000"/>
         <w:sz w:val="17"/>
       </w:rPr>
-      <w:t>NZALC | 2 ER Command Off-site</w:t>
+      <w:t>NZALC | Te Whiā Command Week 2026</w:t>
       <w:tab/>
       <w:t>ACS 2026</w:t>
       <w:tab/>
@@ -1156,7 +1179,7 @@
         <w:color w:val="000000"/>
         <w:sz w:val="17"/>
       </w:rPr>
-      <w:t>NZALC | 2 ER Command Off-site</w:t>
+      <w:t>NZALC | Te Whiā Command Week 2026</w:t>
       <w:tab/>
       <w:t>ACS 2026</w:t>
       <w:tab/>
@@ -1472,7 +1495,7 @@
       <w:rFonts w:ascii="Arial" w:hAnsi="Arial" w:cs="Arial" w:eastAsia="WenQuanYi Zen Hei"/>
       <w:color w:val="000000"/>
       <w:kern w:val="0"/>
-      <w:sz w:val="21"/>
+      <w:sz w:val="20"/>
       <w:szCs w:val="22"/>
       <w:lang w:val="en-US" w:eastAsia="en-US" w:bidi="ar-SA"/>
     </w:rPr>

</xml_diff>

<commit_message>
2 ER Command Week: apply markups
Title now 2 ER Command Week, 16 to 20 Nov 2026 with the kicker removed.
Originator is NZALC alone, dated 17 September 2026. Purpose refers to
the 2 ER Command Week; participants up to 18; participants complete the
ROCKET Model Survey as well as the Leadership Personality Report.
Coordination reduced to numbers, venue, and LPR and survey timelines.
Footer reads NZALC | 2 ER Command Week 2026.

Co-Authored-By: Claude Fable 5.1 <noreply@anthropic.com>
Claude-Session: https://claude.ai/code/session_01LgFPs3fMSncBgbYQ3PfA3o
</commit_message>
<xml_diff>
--- a/output/2er-command-week-nzalc-support.docx
+++ b/output/2er-command-week-nzalc-support.docx
@@ -54,26 +54,6 @@
         <w:pStyle w:val="Normal"/>
         <w:keepNext w:val="true"/>
         <w:pageBreakBefore w:val="false"/>
-        <w:spacing w:before="0" w:after="0"/>
-        <w:rPr/>
-      </w:pPr>
-      <w:r>
-        <w:rPr>
-          <w:rFonts w:cs="Arial"/>
-          <w:b/>
-          <w:i w:val="false"/>
-          <w:color w:val="002516"/>
-          <w:spacing w:val="40"/>
-          <w:sz w:val="20"/>
-        </w:rPr>
-        <w:t>NZALC LEADERSHIP DEVELOPMENT SUPPORT TO 2 ER</w:t>
-      </w:r>
-    </w:p>
-    <w:p>
-      <w:pPr>
-        <w:pStyle w:val="Normal"/>
-        <w:keepNext w:val="true"/>
-        <w:pageBreakBefore w:val="false"/>
         <w:spacing w:before="0" w:after="80"/>
         <w:rPr/>
       </w:pPr>
@@ -84,7 +64,7 @@
           <w:color w:val="000000"/>
           <w:sz w:val="48"/>
         </w:rPr>
-        <w:t>Te Whiā Command Week 2026</w:t>
+        <w:t>2 ER Command Week, 16 to 20 Nov 2026</w:t>
       </w:r>
     </w:p>
     <w:p>
@@ -116,7 +96,7 @@
           <w:color w:val="002516"/>
           <w:sz w:val="20"/>
         </w:rPr>
-        <w:t>New Zealand Army Leadership Centre | Army Command School</w:t>
+        <w:t>New Zealand Army Leadership Centre</w:t>
       </w:r>
     </w:p>
     <w:p>
@@ -144,7 +124,7 @@
           <w:color w:val="000000"/>
           <w:sz w:val="18"/>
         </w:rPr>
-        <w:t>September 2026</w:t>
+        <w:t>17 September 2026</w:t>
       </w:r>
     </w:p>
     <w:p>
@@ -186,7 +166,7 @@
           <w:b w:val="false"/>
           <w:i w:val="false"/>
         </w:rPr>
-        <w:t>To outline NZALC's contribution to Te Whiā Command Week 2026.</w:t>
+        <w:t>To outline NZALC's contribution to the 2 ER Command Week 2026.</w:t>
       </w:r>
     </w:p>
     <w:p>
@@ -683,7 +663,7 @@
           <w:b w:val="false"/>
           <w:i w:val="false"/>
         </w:rPr>
-        <w:t xml:space="preserve"> Up to 17 personnel drawn from 2 ER unit and sub-unit command teams and relevant principal staff.</w:t>
+        <w:t xml:space="preserve"> Up to 18 personnel drawn from 2 ER unit and sub-unit command teams and relevant principal staff.</w:t>
       </w:r>
     </w:p>
     <w:p>
@@ -771,7 +751,7 @@
           <w:b w:val="false"/>
           <w:i w:val="false"/>
         </w:rPr>
-        <w:t xml:space="preserve"> Each participant is to complete a Leadership Personality Report before the facilitated session.</w:t>
+        <w:t xml:space="preserve"> Each participant is to complete a Leadership Personality Report and ROCKET Model Survey before the facilitated session.</w:t>
       </w:r>
     </w:p>
     <w:p>
@@ -875,7 +855,7 @@
           <w:b w:val="false"/>
           <w:i w:val="false"/>
         </w:rPr>
-        <w:t>relevant command relationships and team transitions;</w:t>
+        <w:t>venue and available training facilities; and</w:t>
       </w:r>
     </w:p>
     <w:p>
@@ -911,79 +891,7 @@
           <w:b w:val="false"/>
           <w:i w:val="false"/>
         </w:rPr>
-        <w:t>venue and available training facilities;</w:t>
-      </w:r>
-    </w:p>
-    <w:p>
-      <w:pPr>
-        <w:pStyle w:val="Normal"/>
-        <w:tabs>
-          <w:tab w:val="clear" w:pos="720"/>
-          <w:tab w:val="left" w:pos="397" w:leader="none"/>
-        </w:tabs>
-        <w:spacing w:before="0" w:after="40"/>
-        <w:ind w:hanging="238" w:left="397"/>
-        <w:rPr/>
-      </w:pPr>
-      <w:r>
-        <w:rPr>
-          <w:rFonts w:cs="Arial"/>
-          <w:b/>
-          <w:color w:val="002516"/>
-        </w:rPr>
-        <w:t>•</w:t>
-      </w:r>
-      <w:r>
-        <w:rPr>
-          <w:rFonts w:cs="Arial"/>
-          <w:b/>
-          <w:color w:val="002516"/>
-        </w:rPr>
-        <w:tab/>
-      </w:r>
-      <w:r>
-        <w:rPr>
-          <w:rFonts w:cs="Arial"/>
-          <w:b w:val="false"/>
-          <w:i w:val="false"/>
-        </w:rPr>
-        <w:t>arrangements and timelines for completing the Leadership Personality Reports; and</w:t>
-      </w:r>
-    </w:p>
-    <w:p>
-      <w:pPr>
-        <w:pStyle w:val="Normal"/>
-        <w:tabs>
-          <w:tab w:val="clear" w:pos="720"/>
-          <w:tab w:val="left" w:pos="397" w:leader="none"/>
-        </w:tabs>
-        <w:spacing w:before="0" w:after="40"/>
-        <w:ind w:hanging="238" w:left="397"/>
-        <w:rPr/>
-      </w:pPr>
-      <w:r>
-        <w:rPr>
-          <w:rFonts w:cs="Arial"/>
-          <w:b/>
-          <w:color w:val="002516"/>
-        </w:rPr>
-        <w:t>•</w:t>
-      </w:r>
-      <w:r>
-        <w:rPr>
-          <w:rFonts w:cs="Arial"/>
-          <w:b/>
-          <w:color w:val="002516"/>
-        </w:rPr>
-        <w:tab/>
-      </w:r>
-      <w:r>
-        <w:rPr>
-          <w:rFonts w:cs="Arial"/>
-          <w:b w:val="false"/>
-          <w:i w:val="false"/>
-        </w:rPr>
-        <w:t>any specific command outcomes that should inform the facilitation.</w:t>
+        <w:t>arrangements and timelines for completing the Leadership Personality Reports and ROCKET Model Survey.</w:t>
       </w:r>
     </w:p>
     <w:sectPr>
@@ -1055,7 +963,7 @@
         <w:color w:val="000000"/>
         <w:sz w:val="17"/>
       </w:rPr>
-      <w:t>NZALC | Te Whiā Command Week 2026</w:t>
+      <w:t>NZALC | 2 ER Command Week 2026</w:t>
       <w:tab/>
       <w:t>ACS 2026</w:t>
       <w:tab/>
@@ -1179,7 +1087,7 @@
         <w:color w:val="000000"/>
         <w:sz w:val="17"/>
       </w:rPr>
-      <w:t>NZALC | Te Whiā Command Week 2026</w:t>
+      <w:t>NZALC | 2 ER Command Week 2026</w:t>
       <w:tab/>
       <w:t>ACS 2026</w:t>
       <w:tab/>

</xml_diff>

<commit_message>
NZALC Support to 2 ER Command Week: apply markups
Title now NZALC Support to 2 ER Command Week. The Tuesday 1200 to 1400
flexibility period becomes a third, subdued programme card. Participants
are drawn from 2 ER unit, incl sub-unit command teams.

Co-Authored-By: Claude Fable 5.1 <noreply@anthropic.com>
Claude-Session: https://claude.ai/code/session_01LgFPs3fMSncBgbYQ3PfA3o
</commit_message>
<xml_diff>
--- a/output/2er-command-week-nzalc-support.docx
+++ b/output/2er-command-week-nzalc-support.docx
@@ -64,7 +64,7 @@
           <w:color w:val="000000"/>
           <w:sz w:val="48"/>
         </w:rPr>
-        <w:t>2 ER Command Week, 16 to 20 Nov 2026</w:t>
+        <w:t>NZALC Support to 2 ER Command Week</w:t>
       </w:r>
     </w:p>
     <w:p>
@@ -442,7 +442,7 @@
             <w:tcBorders>
               <w:top w:val="single" w:sz="4" w:space="0" w:color="D9D9D2"/>
               <w:left w:val="single" w:sz="4" w:space="0" w:color="A89662"/>
-              <w:bottom w:val="single" w:sz="4" w:space="0" w:color="A89662"/>
+              <w:bottom w:val="single" w:sz="4" w:space="0" w:color="D9D9D2"/>
               <w:right w:val="single" w:sz="4" w:space="0" w:color="D9D9D2"/>
             </w:tcBorders>
             <w:shd w:color="auto" w:fill="CDD2B7" w:val="clear"/>
@@ -471,7 +471,7 @@
             <w:tcBorders>
               <w:top w:val="single" w:sz="4" w:space="0" w:color="D9D9D2"/>
               <w:left w:val="single" w:sz="4" w:space="0" w:color="D9D9D2"/>
-              <w:bottom w:val="single" w:sz="4" w:space="0" w:color="A89662"/>
+              <w:bottom w:val="single" w:sz="4" w:space="0" w:color="D9D9D2"/>
               <w:right w:val="single" w:sz="4" w:space="0" w:color="D9D9D2"/>
             </w:tcBorders>
           </w:tcPr>
@@ -498,7 +498,7 @@
             <w:tcBorders>
               <w:top w:val="single" w:sz="4" w:space="0" w:color="D9D9D2"/>
               <w:left w:val="single" w:sz="4" w:space="0" w:color="D9D9D2"/>
-              <w:bottom w:val="single" w:sz="4" w:space="0" w:color="A89662"/>
+              <w:bottom w:val="single" w:sz="4" w:space="0" w:color="D9D9D2"/>
               <w:right w:val="single" w:sz="4" w:space="0" w:color="A89662"/>
             </w:tcBorders>
           </w:tcPr>
@@ -520,6 +520,94 @@
           </w:p>
         </w:tc>
       </w:tr>
+      <w:tr>
+        <w:trPr>
+          <w:cantSplit w:val="true"/>
+        </w:trPr>
+        <w:tc>
+          <w:tcPr>
+            <w:tcW w:w="2040" w:type="dxa"/>
+            <w:tcBorders>
+              <w:top w:val="single" w:sz="4" w:space="0" w:color="D9D9D2"/>
+              <w:left w:val="single" w:sz="4" w:space="0" w:color="A89662"/>
+              <w:bottom w:val="single" w:sz="4" w:space="0" w:color="A89662"/>
+              <w:right w:val="single" w:sz="4" w:space="0" w:color="D9D9D2"/>
+            </w:tcBorders>
+            <w:shd w:color="auto" w:fill="CDD2B7" w:val="clear"/>
+          </w:tcPr>
+          <w:p>
+            <w:pPr>
+              <w:pStyle w:val="Normal"/>
+              <w:spacing w:lineRule="auto" w:line="268" w:before="0" w:after="0"/>
+              <w:rPr/>
+            </w:pPr>
+            <w:r>
+              <w:rPr>
+                <w:rFonts w:cs="Arial"/>
+                <w:b/>
+                <w:i w:val="false"/>
+                <w:color w:val="002516"/>
+                <w:sz w:val="18"/>
+              </w:rPr>
+              <w:t>Tuesday 17 November, 1200 to 1400</w:t>
+            </w:r>
+          </w:p>
+        </w:tc>
+        <w:tc>
+          <w:tcPr>
+            <w:tcW w:w="3629" w:type="dxa"/>
+            <w:tcBorders>
+              <w:top w:val="single" w:sz="4" w:space="0" w:color="D9D9D2"/>
+              <w:left w:val="single" w:sz="4" w:space="0" w:color="D9D9D2"/>
+              <w:bottom w:val="single" w:sz="4" w:space="0" w:color="A89662"/>
+              <w:right w:val="single" w:sz="4" w:space="0" w:color="D9D9D2"/>
+            </w:tcBorders>
+          </w:tcPr>
+          <w:p>
+            <w:pPr>
+              <w:pStyle w:val="Normal"/>
+              <w:spacing w:lineRule="auto" w:line="268" w:before="0" w:after="0"/>
+              <w:rPr/>
+            </w:pPr>
+            <w:r>
+              <w:rPr>
+                <w:rFonts w:cs="Arial"/>
+                <w:b w:val="false"/>
+                <w:i w:val="false"/>
+                <w:sz w:val="18"/>
+              </w:rPr>
+              <w:t>Flexibility</w:t>
+            </w:r>
+          </w:p>
+        </w:tc>
+        <w:tc>
+          <w:tcPr>
+            <w:tcW w:w="3628" w:type="dxa"/>
+            <w:tcBorders>
+              <w:top w:val="single" w:sz="4" w:space="0" w:color="D9D9D2"/>
+              <w:left w:val="single" w:sz="4" w:space="0" w:color="D9D9D2"/>
+              <w:bottom w:val="single" w:sz="4" w:space="0" w:color="A89662"/>
+              <w:right w:val="single" w:sz="4" w:space="0" w:color="A89662"/>
+            </w:tcBorders>
+          </w:tcPr>
+          <w:p>
+            <w:pPr>
+              <w:pStyle w:val="Normal"/>
+              <w:spacing w:lineRule="auto" w:line="268" w:before="0" w:after="0"/>
+              <w:rPr/>
+            </w:pPr>
+            <w:r>
+              <w:rPr>
+                <w:rFonts w:cs="Arial"/>
+                <w:b w:val="false"/>
+                <w:i w:val="false"/>
+                <w:sz w:val="18"/>
+              </w:rPr>
+              <w:t>Retained to continue productive discussion or consolidate learning if required.</w:t>
+            </w:r>
+          </w:p>
+        </w:tc>
+      </w:tr>
     </w:tbl>
     <w:p>
       <w:pPr>
@@ -529,21 +617,6 @@
       </w:pPr>
       <w:r>
         <w:rPr/>
-      </w:r>
-    </w:p>
-    <w:p>
-      <w:pPr>
-        <w:pStyle w:val="Normal"/>
-        <w:spacing w:lineRule="auto" w:line="264" w:before="0" w:after="80"/>
-        <w:rPr/>
-      </w:pPr>
-      <w:r>
-        <w:rPr>
-          <w:rFonts w:cs="Arial"/>
-          <w:b w:val="false"/>
-          <w:i w:val="false"/>
-        </w:rPr>
-        <w:t>The period 1200 to 1400 Tuesday will be retained as flexibility to continue productive discussion or consolidate learning if required.</w:t>
       </w:r>
     </w:p>
     <w:p>
@@ -663,7 +736,7 @@
           <w:b w:val="false"/>
           <w:i w:val="false"/>
         </w:rPr>
-        <w:t xml:space="preserve"> Up to 18 personnel drawn from 2 ER unit and sub-unit command teams and relevant principal staff.</w:t>
+        <w:t xml:space="preserve"> Up to 18 personnel drawn from 2 ER unit, incl sub-unit command teams and relevant principal staff.</w:t>
       </w:r>
     </w:p>
     <w:p>

</xml_diff>